<commit_message>
Employee devices newly fixed and document created
</commit_message>
<xml_diff>
--- a/document/Module documents/Attendance_Late_Tracking_User_Manual.docx
+++ b/document/Module documents/Attendance_Late_Tracking_User_Manual.docx
@@ -1199,7 +1199,7 @@
           <w:color w:val="333333"/>
           <w:sz w:val="21"/>
         </w:rPr>
-        <w:t>Open Late Tracking → Late Records. Each check-in shows whether it Is Late, the Late Time (H:MM), the Session, whether it is a Half Day, the Late # in the month, the Deduction Amount and whether it was Waived. Use the Late Only, With Deduction, Missing Reason and group-by filters to focus.</w:t>
+        <w:t>Open Late Tracking → Late Records. Each check-in shows whether it Is Late, the Late Time (H:MM), the Session, whether it is a Half Day, the Late # in the month, the Deduction Amount and whether it was Waived. Use the Late Only, With Deduction, Missing Reason and group-by filters to focus. The Late Reason now appears as a column by default, so the explanation is visible without opening each record.</w:t>
       </w:r>
     </w:p>
     <w:p>
@@ -1309,7 +1309,7 @@
           <w:color w:val="333333"/>
           <w:sz w:val="21"/>
         </w:rPr>
-        <w:t>On a late attendance, click Enter Late Reason in the Late Tracking section and type the explanation, or type straight into the Late Reason field. The button is hidden once a reason is filled or the record is waived.</w:t>
+        <w:t>On a late attendance, click Enter Late Reason in the Late Tracking section and type the explanation, or type straight into the Late Reason field. The button is hidden once a reason is filled or the record is waived. Before you save, the pop-up previews the late time, the session, the expected start, the Late # in the month and the Deduction amount, so you can see exactly what will be deducted. Once a reason is saved the button changes to Update Reason (click it to edit the wording), and the button is also hidden after check-out.</w:t>
       </w:r>
     </w:p>
     <w:tbl>
@@ -2593,6 +2593,21 @@
     </w:p>
     <w:p>
       <w:pPr>
+        <w:pStyle w:val="ListBullet"/>
+        <w:spacing w:after="40"/>
+      </w:pPr>
+      <w:r>
+        <w:rPr>
+          <w:b w:val="0"/>
+          <w:i w:val="0"/>
+          <w:color w:val="333333"/>
+          <w:sz w:val="21"/>
+        </w:rPr>
+        <w:t>A late check-in cannot be saved in the backend without a Late Reason — enter it through the Enter Late Reason pop-up first (waived records are exempt).</w:t>
+      </w:r>
+    </w:p>
+    <w:p>
+      <w:pPr>
         <w:spacing w:after="0"/>
       </w:pPr>
     </w:p>

</xml_diff>

<commit_message>
Module and app documents updated with deviation thinks updated in module and apps also
</commit_message>
<xml_diff>
--- a/document/Module documents/Attendance_Late_Tracking_User_Manual.docx
+++ b/document/Module documents/Attendance_Late_Tracking_User_Manual.docx
@@ -647,6 +647,18 @@
             </a:graphic>
           </wp:inline>
         </w:drawing>
+      </w:r>
+    </w:p>
+    <w:p>
+      <w:pPr>
+        <w:pStyle w:val="ListBullet"/>
+      </w:pPr>
+      <w:r>
+        <w:rPr>
+          <w:b/>
+          <w:sz w:val="21"/>
+        </w:rPr>
+        <w:t>Trip Deviation Check — Trip KM Tolerance (default 5 km) and Trip Time Tolerance (Minutes) (default 10) set how far a field trip may exceed its Estimated KM / Time before it is flagged “Over — Check”, which forces the driver to enter a Deviation Reason.</w:t>
       </w:r>
     </w:p>
     <w:p>
@@ -2613,6 +2625,18 @@
     </w:p>
     <w:p>
       <w:pPr>
+        <w:pStyle w:val="ListBullet"/>
+      </w:pPr>
+      <w:r>
+        <w:rPr>
+          <w:b w:val="0"/>
+          <w:sz w:val="21"/>
+        </w:rPr>
+        <w:t>Trip KM / Time Tolerances decide when a field trip is flagged Over — Check; raise them to allow bigger deviations before a reason is required.</w:t>
+      </w:r>
+    </w:p>
+    <w:p>
+      <w:pPr>
         <w:jc w:val="center"/>
       </w:pPr>
       <w:r>

</xml_diff>